<commit_message>
add janusz e silva cervi
</commit_message>
<xml_diff>
--- a/tese/_book/A-coordenação-da-competição-intrapartidária-em-listas-abertas-via-alocação-de-fundos-públicos.docx
+++ b/tese/_book/A-coordenação-da-competição-intrapartidária-em-listas-abertas-via-alocação-de-fundos-públicos.docx
@@ -1363,7 +1363,7 @@
         <w:pStyle w:val="Corpodetexto"/>
       </w:pPr>
       <w:r>
-        <w:t xml:space="preserve">A literatura nacional também já identificou a lacuna de avaliação da organização e atuação interna dos partidos políticos para avaliar os efeitos esperados da lista aberta</w:t>
+        <w:t xml:space="preserve">A literatura nacional também já identificou a lacuna de avaliação da organização e atuação interna dos partidos políticos considerando os efeitos esperados da lista aberta</w:t>
       </w:r>
       <w:r>
         <w:t xml:space="preserve"> </w:t>
@@ -1372,13 +1372,19 @@
         <w:t xml:space="preserve">(Ribeiro, 2013)</w:t>
       </w:r>
       <w:r>
-        <w:t xml:space="preserve">. Analisando os estatutos partidários, Ribeiro (</w:t>
+        <w:t xml:space="preserve">. Analisando os estatutos partidários, Ribeiro</w:t>
+      </w:r>
+      <w:r>
+        <w:t xml:space="preserve"> </w:t>
       </w:r>
       <w:r>
         <w:t xml:space="preserve">(2013)</w:t>
       </w:r>
       <w:r>
-        <w:t xml:space="preserve">) propõe observar a</w:t>
+        <w:t xml:space="preserve"> </w:t>
+      </w:r>
+      <w:r>
+        <w:t xml:space="preserve">propõe observar a</w:t>
       </w:r>
       <w:r>
         <w:t xml:space="preserve"> </w:t>
@@ -1452,7 +1458,7 @@
         <w:t xml:space="preserve"> </w:t>
       </w:r>
       <w:r>
-        <w:t xml:space="preserve">aplicada aos partidos políticos, que foca nos recursos essenciais para a sobrevivência organizacional das legendas para explicar suas capacidades organizacionais e particularidades estratégicas</w:t>
+        <w:t xml:space="preserve">aplicada aos partidos políticos, que foca nos recursos essenciais para a sobrevivência das legendas para explicar suas capacidades organizacionais e particularidades estratégicas</w:t>
       </w:r>
       <w:r>
         <w:t xml:space="preserve"> </w:t>
@@ -1677,13 +1683,10 @@
         <w:t xml:space="preserve"> </w:t>
       </w:r>
       <w:r>
-        <w:t xml:space="preserve">(</w:t>
-      </w:r>
-      <w:r>
-        <w:t xml:space="preserve">(2001a)</w:t>
-      </w:r>
-      <w:r>
-        <w:t xml:space="preserve">, p. 100).</w:t>
+        <w:t xml:space="preserve">(2001a, p. 100)</w:t>
+      </w:r>
+      <w:r>
+        <w:t xml:space="preserve">.</w:t>
       </w:r>
     </w:p>
     <w:p>
@@ -2116,7 +2119,7 @@
     </w:p>
     <w:bookmarkEnd w:id="28"/>
     <w:bookmarkEnd w:id="29"/>
-    <w:bookmarkStart w:id="79" w:name="X106d2aaaffc6e23b4f14a1ec11bf8bbb6fa4fa4"/>
+    <w:bookmarkStart w:id="80" w:name="X106d2aaaffc6e23b4f14a1ec11bf8bbb6fa4fa4"/>
     <w:p>
       <w:pPr>
         <w:pStyle w:val="Ttulo1"/>
@@ -2130,7 +2133,7 @@
         <w:pStyle w:val="FirstParagraph"/>
       </w:pPr>
       <w:r>
-        <w:t xml:space="preserve">Para a primeira geração de estudos sobre o voto preferencial, sistemas como a representação proporcional de lista aberta colocariam em oposição a busca individual de um candidato por votos e o interesse coletivo da organização partidária. Como visto, a segunda geração de estudos sobre o tema reivindica que a existência de tais incentivos não implica que todas as candidaturas disputem em condições semelhantes. Partidos possuem instrumentos para influenciar tais condições.</w:t>
+        <w:t xml:space="preserve">Para a primeira geração de estudos sobre o voto preferencial, sistemas como a representação proporcional de lista aberta colocariam em oposição a busca individual de um candidato por votos e o interesse coletivo da organização partidária. Como visto, a segunda geração de estudos sobre o tema reivindica que a existência de tais incentivos não implica que todas as candidaturas disputem em condições semelhantes, pois partidos possuem instrumentos para influenciar tais condições.</w:t>
       </w:r>
     </w:p>
     <w:p>
@@ -2790,7 +2793,7 @@
         </m:r>
       </m:oMath>
       <w:r>
-        <w:t xml:space="preserve">, um arredondamento convencional. As candidaturas são ordenadas pelos recursos recebidos e as</w:t>
+        <w:t xml:space="preserve">, um arredondamento convencional. As candidaturas são ordenadas de maneira decrescente pelos recursos recebidos e as</w:t>
       </w:r>
       <w:r>
         <w:t xml:space="preserve"> </w:t>
@@ -2866,7 +2869,7 @@
       </w:r>
     </w:p>
     <w:bookmarkEnd w:id="32"/>
-    <w:bookmarkStart w:id="39" w:name="sec-competitivos"/>
+    <w:bookmarkStart w:id="40" w:name="sec-competitivos"/>
     <w:p>
       <w:pPr>
         <w:pStyle w:val="Ttulo2"/>
@@ -2907,6 +2910,12 @@
           <w:iCs/>
         </w:rPr>
         <w:t xml:space="preserve">candidatura competitiva</w:t>
+      </w:r>
+      <w:r>
+        <w:rPr>
+          <w:rStyle w:val="Refdenotaderodap"/>
+        </w:rPr>
+        <w:footnoteReference w:id="33"/>
       </w:r>
       <w:r>
         <w:t xml:space="preserve"> </w:t>
@@ -2944,7 +2953,7 @@
       <w:pPr>
         <w:pStyle w:val="Corpodetexto"/>
       </w:pPr>
-      <w:bookmarkStart w:id="33" w:name="eq-competitivo"/>
+      <w:bookmarkStart w:id="34" w:name="eq-competitivo"/>
       <m:oMathPara>
         <m:oMathParaPr>
           <m:jc m:val="center"/>
@@ -3077,7 +3086,7 @@
           </m:d>
         </m:oMath>
       </m:oMathPara>
-      <w:bookmarkEnd w:id="33"/>
+      <w:bookmarkEnd w:id="34"/>
     </w:p>
     <w:p>
       <w:pPr>
@@ -3093,42 +3102,10 @@
         <w:t xml:space="preserve">Cheibub; Sin (2020)</w:t>
       </w:r>
       <w:r>
-        <w:t xml:space="preserve">. Os autores consideraram também como competitivos os candidatos que atingiram ao menos 10% do quociente eleitoral das eleições sob análise. Isto está em desacordo com o princípio temporal, motivo pelo qual deliberadamente descarta-se como competitivos os candidatos que tiveram performance surpreendente.</w:t>
-      </w:r>
-    </w:p>
-    <w:p>
-      <w:pPr>
-        <w:pStyle w:val="Corpodetexto"/>
-      </w:pPr>
-      <w:r>
-        <w:t xml:space="preserve">Note-se também que os termos</w:t>
-      </w:r>
-      <w:r>
-        <w:t xml:space="preserve"> </w:t>
-      </w:r>
-      <w:r>
-        <w:t xml:space="preserve">“candidaturas com credenciais eleitorais prévias”</w:t>
-      </w:r>
-      <w:r>
-        <w:t xml:space="preserve"> </w:t>
-      </w:r>
-      <w:r>
-        <w:t xml:space="preserve">e</w:t>
-      </w:r>
-      <w:r>
-        <w:t xml:space="preserve"> </w:t>
-      </w:r>
-      <w:r>
-        <w:t xml:space="preserve">“candidaturas competitivas”</w:t>
-      </w:r>
-      <w:r>
-        <w:t xml:space="preserve"> </w:t>
-      </w:r>
-      <w:r>
-        <w:t xml:space="preserve">se referem ao mesmo conjunto de concorrentes e são usados de maneira intercambiada.</w:t>
-      </w:r>
-    </w:p>
-    <w:bookmarkStart w:id="38" w:name="sec-metricas"/>
+        <w:t xml:space="preserve">. Os autores consideraram também como competitivos os candidatos que atingiram ao menos 10% do quociente eleitoral das eleições sob análise. Isto está em desacordo com o princípio temporal, motivo pelo qual deliberadamente descarta-se como competitivos os candidatos novatos que tiveram performance surpreendente.</w:t>
+      </w:r>
+    </w:p>
+    <w:bookmarkStart w:id="39" w:name="sec-metricas"/>
     <w:p>
       <w:pPr>
         <w:pStyle w:val="Ttulo3"/>
@@ -3467,7 +3444,7 @@
       <w:pPr>
         <w:pStyle w:val="Corpodetexto"/>
       </w:pPr>
-      <w:bookmarkStart w:id="34" w:name="eq-acerto"/>
+      <w:bookmarkStart w:id="35" w:name="eq-acerto"/>
       <m:oMathPara>
         <m:oMathParaPr>
           <m:jc m:val="center"/>
@@ -3586,7 +3563,7 @@
           </m:d>
         </m:oMath>
       </m:oMathPara>
-      <w:bookmarkEnd w:id="34"/>
+      <w:bookmarkEnd w:id="35"/>
     </w:p>
     <w:p>
       <w:pPr>
@@ -3617,7 +3594,7 @@
       <w:pPr>
         <w:pStyle w:val="Corpodetexto"/>
       </w:pPr>
-      <w:bookmarkStart w:id="35" w:name="eq-indicadores"/>
+      <w:bookmarkStart w:id="36" w:name="eq-indicadores"/>
       <m:oMathPara>
         <m:oMathParaPr>
           <m:jc m:val="center"/>
@@ -3828,7 +3805,7 @@
           </m:d>
         </m:oMath>
       </m:oMathPara>
-      <w:bookmarkEnd w:id="35"/>
+      <w:bookmarkEnd w:id="36"/>
     </w:p>
     <w:p>
       <w:pPr>
@@ -3896,7 +3873,7 @@
       <w:pPr>
         <w:pStyle w:val="Corpodetexto"/>
       </w:pPr>
-      <w:bookmarkStart w:id="36" w:name="eq-referencia-aleatoria"/>
+      <w:bookmarkStart w:id="37" w:name="eq-referencia-aleatoria"/>
       <m:oMathPara>
         <m:oMathParaPr>
           <m:jc m:val="center"/>
@@ -4012,7 +3989,7 @@
           </m:d>
         </m:oMath>
       </m:oMathPara>
-      <w:bookmarkEnd w:id="36"/>
+      <w:bookmarkEnd w:id="37"/>
     </w:p>
     <w:p>
       <w:pPr>
@@ -4050,7 +4027,7 @@
       <w:pPr>
         <w:pStyle w:val="Corpodetexto"/>
       </w:pPr>
-      <w:bookmarkStart w:id="37" w:name="eq-lift"/>
+      <w:bookmarkStart w:id="38" w:name="eq-lift"/>
       <m:oMathPara>
         <m:oMathParaPr>
           <m:jc m:val="center"/>
@@ -4202,7 +4179,7 @@
           </m:d>
         </m:oMath>
       </m:oMathPara>
-      <w:bookmarkEnd w:id="37"/>
+      <w:bookmarkEnd w:id="38"/>
     </w:p>
     <w:p>
       <w:pPr>
@@ -4423,9 +4400,9 @@
         <w:t xml:space="preserve">de sua relevância eleitoral. Essa correspondência, contudo, não permite distinguir a seleção de candidaturas previamente viáveis dos possíveis efeitos do financiamento sobre suas chances de eleição.</w:t>
       </w:r>
     </w:p>
-    <w:bookmarkEnd w:id="38"/>
     <w:bookmarkEnd w:id="39"/>
-    <w:bookmarkStart w:id="55" w:name="resultados"/>
+    <w:bookmarkEnd w:id="40"/>
+    <w:bookmarkStart w:id="56" w:name="resultados"/>
     <w:p>
       <w:pPr>
         <w:pStyle w:val="Ttulo2"/>
@@ -4434,7 +4411,7 @@
         <w:t xml:space="preserve">3.4 Resultados</w:t>
       </w:r>
     </w:p>
-    <w:bookmarkStart w:id="48" w:name="Xc98ff001544a0bc9dfd18dc0f4597d098f74c3c"/>
+    <w:bookmarkStart w:id="49" w:name="Xc98ff001544a0bc9dfd18dc0f4597d098f74c3c"/>
     <w:p>
       <w:pPr>
         <w:pStyle w:val="Ttulo3"/>
@@ -4519,7 +4496,7 @@
       <w:tr>
         <w:tc>
           <w:tcPr/>
-          <w:bookmarkStart w:id="43" w:name="fig-amplitude"/>
+          <w:bookmarkStart w:id="44" w:name="fig-amplitude"/>
           <w:p>
             <w:pPr>
               <w:jc w:val="center"/>
@@ -4543,18 +4520,18 @@
                 <wp:inline>
                   <wp:extent cx="5600700" cy="2520315"/>
                   <wp:effectExtent b="0" l="0" r="0" t="0"/>
-                  <wp:docPr descr="" title="" id="41" name="Picture"/>
+                  <wp:docPr descr="" title="" id="42" name="Picture"/>
                   <a:graphic>
                     <a:graphicData uri="http://schemas.openxmlformats.org/drawingml/2006/picture">
                       <pic:pic>
                         <pic:nvPicPr>
-                          <pic:cNvPr descr="../figs/cap3_fig_amplitude_barras.png" id="42" name="Picture"/>
+                          <pic:cNvPr descr="../figs/cap3_fig_amplitude_barras.png" id="43" name="Picture"/>
                           <pic:cNvPicPr>
                             <a:picLocks noChangeArrowheads="1" noChangeAspect="1"/>
                           </pic:cNvPicPr>
                         </pic:nvPicPr>
                         <pic:blipFill>
-                          <a:blip r:embed="rId40"/>
+                          <a:blip r:embed="rId41"/>
                           <a:stretch>
                             <a:fillRect/>
                           </a:stretch>
@@ -4581,7 +4558,7 @@
               </w:drawing>
             </w:r>
           </w:p>
-          <w:bookmarkEnd w:id="43"/>
+          <w:bookmarkEnd w:id="44"/>
         </w:tc>
       </w:tr>
     </w:tbl>
@@ -4659,7 +4636,7 @@
       <w:tr>
         <w:tc>
           <w:tcPr/>
-          <w:bookmarkStart w:id="47" w:name="fig-concentracao"/>
+          <w:bookmarkStart w:id="48" w:name="fig-concentracao"/>
           <w:p>
             <w:pPr>
               <w:jc w:val="center"/>
@@ -4681,20 +4658,20 @@
             <w:r>
               <w:drawing>
                 <wp:inline>
-                  <wp:extent cx="5600700" cy="2144601"/>
+                  <wp:extent cx="3080385" cy="2177595"/>
                   <wp:effectExtent b="0" l="0" r="0" t="0"/>
-                  <wp:docPr descr="" title="" id="45" name="Picture"/>
+                  <wp:docPr descr="" title="" id="46" name="Picture"/>
                   <a:graphic>
                     <a:graphicData uri="http://schemas.openxmlformats.org/drawingml/2006/picture">
                       <pic:pic>
                         <pic:nvPicPr>
-                          <pic:cNvPr descr="../figs/cap3_fig_concentracao_barras.png" id="46" name="Picture"/>
+                          <pic:cNvPr descr="../figs/cap3_fig_concentracao_barras.png" id="47" name="Picture"/>
                           <pic:cNvPicPr>
                             <a:picLocks noChangeArrowheads="1" noChangeAspect="1"/>
                           </pic:cNvPicPr>
                         </pic:nvPicPr>
                         <pic:blipFill>
-                          <a:blip r:embed="rId44"/>
+                          <a:blip r:embed="rId45"/>
                           <a:stretch>
                             <a:fillRect/>
                           </a:stretch>
@@ -4702,7 +4679,7 @@
                         <pic:spPr bwMode="auto">
                           <a:xfrm>
                             <a:off x="0" y="0"/>
-                            <a:ext cx="5600700" cy="2144601"/>
+                            <a:ext cx="3080385" cy="2177595"/>
                           </a:xfrm>
                           <a:prstGeom prst="rect">
                             <a:avLst/>
@@ -4721,7 +4698,7 @@
               </w:drawing>
             </w:r>
           </w:p>
-          <w:bookmarkEnd w:id="47"/>
+          <w:bookmarkEnd w:id="48"/>
         </w:tc>
       </w:tr>
     </w:tbl>
@@ -4745,8 +4722,8 @@
         <w:t xml:space="preserve">sobre o afunilamento das candidaturas quando se considera a competitividade prévia e concentração de recursos partidários intralista. Há indicativos de que apenas a metade das candidaturas são financiadas por seus partidos de maneira efetiva. Todavia, apenas estes indicadores não sustentam sozinhos a ideia de priorização financeira. A seção seguinte operacionaliza o núcleo partidário priorizado em recursos e valida as seleções realizadas por diferentes critérios.</w:t>
       </w:r>
     </w:p>
-    <w:bookmarkEnd w:id="48"/>
-    <w:bookmarkStart w:id="54" w:name="priorização-financeira-pelo-top-necr"/>
+    <w:bookmarkEnd w:id="49"/>
+    <w:bookmarkStart w:id="55" w:name="priorização-financeira-pelo-top-necr"/>
     <w:p>
       <w:pPr>
         <w:pStyle w:val="Ttulo3"/>
@@ -4849,7 +4826,7 @@
       <w:tr>
         <w:tc>
           <w:tcPr/>
-          <w:bookmarkStart w:id="52" w:name="fig-cap3-03-top-necr"/>
+          <w:bookmarkStart w:id="53" w:name="fig-cap3-03-top-necr"/>
           <w:p>
             <w:pPr>
               <w:jc w:val="center"/>
@@ -4889,18 +4866,18 @@
                 <wp:inline>
                   <wp:extent cx="5600700" cy="1892295"/>
                   <wp:effectExtent b="0" l="0" r="0" t="0"/>
-                  <wp:docPr descr="" title="" id="50" name="Picture"/>
+                  <wp:docPr descr="" title="" id="51" name="Picture"/>
                   <a:graphic>
                     <a:graphicData uri="http://schemas.openxmlformats.org/drawingml/2006/picture">
                       <pic:pic>
                         <pic:nvPicPr>
-                          <pic:cNvPr descr="../figs/cap3_fig_top_necr.png" id="51" name="Picture"/>
+                          <pic:cNvPr descr="../figs/cap3_fig_top_necr.png" id="52" name="Picture"/>
                           <pic:cNvPicPr>
                             <a:picLocks noChangeArrowheads="1" noChangeAspect="1"/>
                           </pic:cNvPicPr>
                         </pic:nvPicPr>
                         <pic:blipFill>
-                          <a:blip r:embed="rId49"/>
+                          <a:blip r:embed="rId50"/>
                           <a:stretch>
                             <a:fillRect/>
                           </a:stretch>
@@ -4927,7 +4904,7 @@
               </w:drawing>
             </w:r>
           </w:p>
-          <w:bookmarkEnd w:id="52"/>
+          <w:bookmarkEnd w:id="53"/>
         </w:tc>
       </w:tr>
     </w:tbl>
@@ -4985,7 +4962,7 @@
       <w:tr>
         <w:tc>
           <w:tcPr/>
-          <w:bookmarkStart w:id="53" w:name="tbl-cap3-01-lift-magnitude"/>
+          <w:bookmarkStart w:id="54" w:name="tbl-cap3-01-lift-magnitude"/>
           <w:p>
             <w:pPr>
               <w:jc w:val="center"/>
@@ -5166,14 +5143,14 @@
               </w:tc>
             </w:tr>
           </w:tbl>
-          <w:bookmarkEnd w:id="53"/>
+          <w:bookmarkEnd w:id="54"/>
           <w:p/>
         </w:tc>
       </w:tr>
     </w:tbl>
-    <w:bookmarkEnd w:id="54"/>
     <w:bookmarkEnd w:id="55"/>
-    <w:bookmarkStart w:id="72" w:name="robustez-da-operacionalização"/>
+    <w:bookmarkEnd w:id="56"/>
+    <w:bookmarkStart w:id="73" w:name="robustez-da-operacionalização"/>
     <w:p>
       <w:pPr>
         <w:pStyle w:val="Ttulo2"/>
@@ -5182,7 +5159,7 @@
         <w:t xml:space="preserve">3.5 Robustez da operacionalização</w:t>
       </w:r>
     </w:p>
-    <w:bookmarkStart w:id="61" w:name="X6e76b9f960f9830fb01c551e1e835dd0b730392"/>
+    <w:bookmarkStart w:id="62" w:name="X6e76b9f960f9830fb01c551e1e835dd0b730392"/>
     <w:p>
       <w:pPr>
         <w:pStyle w:val="Ttulo3"/>
@@ -5269,7 +5246,7 @@
       <w:tr>
         <w:tc>
           <w:tcPr/>
-          <w:bookmarkStart w:id="59" w:name="fig-cap3-03-top-necr-eleicao"/>
+          <w:bookmarkStart w:id="60" w:name="fig-cap3-03-top-necr-eleicao"/>
           <w:p>
             <w:pPr>
               <w:jc w:val="center"/>
@@ -5309,18 +5286,18 @@
                 <wp:inline>
                   <wp:extent cx="5600700" cy="1892295"/>
                   <wp:effectExtent b="0" l="0" r="0" t="0"/>
-                  <wp:docPr descr="" title="" id="57" name="Picture"/>
+                  <wp:docPr descr="" title="" id="58" name="Picture"/>
                   <a:graphic>
                     <a:graphicData uri="http://schemas.openxmlformats.org/drawingml/2006/picture">
                       <pic:pic>
                         <pic:nvPicPr>
-                          <pic:cNvPr descr="../figs/cap3_fig_top_necr_eleicao.png" id="58" name="Picture"/>
+                          <pic:cNvPr descr="../figs/cap3_fig_top_necr_eleicao.png" id="59" name="Picture"/>
                           <pic:cNvPicPr>
                             <a:picLocks noChangeArrowheads="1" noChangeAspect="1"/>
                           </pic:cNvPicPr>
                         </pic:nvPicPr>
                         <pic:blipFill>
-                          <a:blip r:embed="rId56"/>
+                          <a:blip r:embed="rId57"/>
                           <a:stretch>
                             <a:fillRect/>
                           </a:stretch>
@@ -5347,7 +5324,7 @@
               </w:drawing>
             </w:r>
           </w:p>
-          <w:bookmarkEnd w:id="59"/>
+          <w:bookmarkEnd w:id="60"/>
         </w:tc>
       </w:tr>
     </w:tbl>
@@ -5405,7 +5382,7 @@
       <w:tr>
         <w:tc>
           <w:tcPr/>
-          <w:bookmarkStart w:id="60" w:name="tbl-cap3-02-lift-magnitude-eleicao"/>
+          <w:bookmarkStart w:id="61" w:name="tbl-cap3-02-lift-magnitude-eleicao"/>
           <w:p>
             <w:pPr>
               <w:jc w:val="center"/>
@@ -5586,13 +5563,13 @@
               </w:tc>
             </w:tr>
           </w:tbl>
-          <w:bookmarkEnd w:id="60"/>
+          <w:bookmarkEnd w:id="61"/>
           <w:p/>
         </w:tc>
       </w:tr>
     </w:tbl>
-    <w:bookmarkEnd w:id="61"/>
-    <w:bookmarkStart w:id="71" w:name="sensibilidade-ao-limiar-top-x"/>
+    <w:bookmarkEnd w:id="62"/>
+    <w:bookmarkStart w:id="72" w:name="sensibilidade-ao-limiar-top-x"/>
     <w:p>
       <w:pPr>
         <w:pStyle w:val="Ttulo3"/>
@@ -5629,7 +5606,7 @@
       <w:pPr>
         <w:pStyle w:val="Corpodetexto"/>
       </w:pPr>
-      <w:bookmarkStart w:id="62" w:name="eq-ktopx"/>
+      <w:bookmarkStart w:id="63" w:name="eq-ktopx"/>
       <m:oMathPara>
         <m:oMathParaPr>
           <m:jc m:val="center"/>
@@ -5977,7 +5954,7 @@
           </m:d>
         </m:oMath>
       </m:oMathPara>
-      <w:bookmarkEnd w:id="62"/>
+      <w:bookmarkEnd w:id="63"/>
     </w:p>
     <w:p>
       <w:pPr>
@@ -6072,7 +6049,7 @@
         <w:t xml:space="preserve"> </w:t>
       </w:r>
       <w:r>
-        <w:t xml:space="preserve">normaliza essa variação pelo valor de referência de cada lista e permanece acima de um em todos os limiares. Mesmo no Top-95%, o corte mais permissivo calculado, ele é 1,55 em 2018 e 1,37 em 2022.</w:t>
+        <w:t xml:space="preserve">normaliza essa variação pela referência aleatórica calculada para cada lista e permanece acima de um em todos os limiares. Mesmo no Top-95%, o corte mais permissivo calculado, ele é 1,55 em 2018 e 1,37 em 2022.</w:t>
       </w:r>
     </w:p>
     <w:p>
@@ -6096,7 +6073,7 @@
       <w:tr>
         <w:tc>
           <w:tcPr/>
-          <w:bookmarkStart w:id="66" w:name="fig-cap3-04-topx-competitividade"/>
+          <w:bookmarkStart w:id="67" w:name="fig-cap3-04-topx-competitividade"/>
           <w:p>
             <w:pPr>
               <w:jc w:val="center"/>
@@ -6136,18 +6113,18 @@
                 <wp:inline>
                   <wp:extent cx="5600700" cy="3459255"/>
                   <wp:effectExtent b="0" l="0" r="0" t="0"/>
-                  <wp:docPr descr="" title="" id="64" name="Picture"/>
+                  <wp:docPr descr="" title="" id="65" name="Picture"/>
                   <a:graphic>
                     <a:graphicData uri="http://schemas.openxmlformats.org/drawingml/2006/picture">
                       <pic:pic>
                         <pic:nvPicPr>
-                          <pic:cNvPr descr="../figs/cap3_fig_topx_competitividade.png" id="65" name="Picture"/>
+                          <pic:cNvPr descr="../figs/cap3_fig_topx_competitividade.png" id="66" name="Picture"/>
                           <pic:cNvPicPr>
                             <a:picLocks noChangeArrowheads="1" noChangeAspect="1"/>
                           </pic:cNvPicPr>
                         </pic:nvPicPr>
                         <pic:blipFill>
-                          <a:blip r:embed="rId63"/>
+                          <a:blip r:embed="rId64"/>
                           <a:stretch>
                             <a:fillRect/>
                           </a:stretch>
@@ -6174,7 +6151,7 @@
               </w:drawing>
             </w:r>
           </w:p>
-          <w:bookmarkEnd w:id="66"/>
+          <w:bookmarkEnd w:id="67"/>
         </w:tc>
       </w:tr>
     </w:tbl>
@@ -6232,7 +6209,7 @@
       <w:tr>
         <w:tc>
           <w:tcPr/>
-          <w:bookmarkStart w:id="70" w:name="fig-cap3-05-topx-eleicao"/>
+          <w:bookmarkStart w:id="71" w:name="fig-cap3-05-topx-eleicao"/>
           <w:p>
             <w:pPr>
               <w:jc w:val="center"/>
@@ -6272,18 +6249,18 @@
                 <wp:inline>
                   <wp:extent cx="5600700" cy="3459255"/>
                   <wp:effectExtent b="0" l="0" r="0" t="0"/>
-                  <wp:docPr descr="" title="" id="68" name="Picture"/>
+                  <wp:docPr descr="" title="" id="69" name="Picture"/>
                   <a:graphic>
                     <a:graphicData uri="http://schemas.openxmlformats.org/drawingml/2006/picture">
                       <pic:pic>
                         <pic:nvPicPr>
-                          <pic:cNvPr descr="../figs/cap3_fig_topx_eleicao.png" id="69" name="Picture"/>
+                          <pic:cNvPr descr="../figs/cap3_fig_topx_eleicao.png" id="70" name="Picture"/>
                           <pic:cNvPicPr>
                             <a:picLocks noChangeArrowheads="1" noChangeAspect="1"/>
                           </pic:cNvPicPr>
                         </pic:nvPicPr>
                         <pic:blipFill>
-                          <a:blip r:embed="rId67"/>
+                          <a:blip r:embed="rId68"/>
                           <a:stretch>
                             <a:fillRect/>
                           </a:stretch>
@@ -6310,13 +6287,13 @@
               </w:drawing>
             </w:r>
           </w:p>
-          <w:bookmarkEnd w:id="70"/>
+          <w:bookmarkEnd w:id="71"/>
         </w:tc>
       </w:tr>
     </w:tbl>
-    <w:bookmarkEnd w:id="71"/>
     <w:bookmarkEnd w:id="72"/>
-    <w:bookmarkStart w:id="77" w:name="sec-premio-credenciais"/>
+    <w:bookmarkEnd w:id="73"/>
+    <w:bookmarkStart w:id="78" w:name="sec-premio-credenciais"/>
     <w:p>
       <w:pPr>
         <w:pStyle w:val="Ttulo2"/>
@@ -6473,7 +6450,7 @@
       <w:tr>
         <w:tc>
           <w:tcPr/>
-          <w:bookmarkStart w:id="76" w:name="fig-reg-frac"/>
+          <w:bookmarkStart w:id="77" w:name="fig-reg-frac"/>
           <w:p>
             <w:pPr>
               <w:jc w:val="center"/>
@@ -6503,18 +6480,18 @@
                 <wp:inline>
                   <wp:extent cx="5600700" cy="4231640"/>
                   <wp:effectExtent b="0" l="0" r="0" t="0"/>
-                  <wp:docPr descr="" title="" id="74" name="Picture"/>
+                  <wp:docPr descr="" title="" id="75" name="Picture"/>
                   <a:graphic>
                     <a:graphicData uri="http://schemas.openxmlformats.org/drawingml/2006/picture">
                       <pic:pic>
                         <pic:nvPicPr>
-                          <pic:cNvPr descr="../figs/cap3_regressao_fracionaria.png" id="75" name="Picture"/>
+                          <pic:cNvPr descr="../figs/cap3_regressao_fracionaria.png" id="76" name="Picture"/>
                           <pic:cNvPicPr>
                             <a:picLocks noChangeArrowheads="1" noChangeAspect="1"/>
                           </pic:cNvPicPr>
                         </pic:nvPicPr>
                         <pic:blipFill>
-                          <a:blip r:embed="rId73"/>
+                          <a:blip r:embed="rId74"/>
                           <a:stretch>
                             <a:fillRect/>
                           </a:stretch>
@@ -6541,7 +6518,7 @@
               </w:drawing>
             </w:r>
           </w:p>
-          <w:bookmarkEnd w:id="76"/>
+          <w:bookmarkEnd w:id="77"/>
         </w:tc>
       </w:tr>
     </w:tbl>
@@ -6553,8 +6530,8 @@
         <w:t xml:space="preserve">Estes resultados são consistentes com os achados do Top-NECr: a mesma vitória eleitoral prévia que aumenta a chance de uma candidatura pertencer ao núcleo priorizado também aumenta, em média, a fatia de recursos que ela recebe dentro da lista. A atenuação de alguns efeitos entre 2018 e 2022 acompanha o próprio crescimento do NECr médio nas listas discutido a seguir: com um núcleo priorizado maior e mais candidaturas recebendo alguma fração dos recursos, cada credencial isolada carrega um prêmio marginal menor sobre a fatia individual, ainda que a priorização como um todo se mantenha.</w:t>
       </w:r>
     </w:p>
-    <w:bookmarkEnd w:id="77"/>
-    <w:bookmarkStart w:id="78" w:name="sec-discussao-cap3"/>
+    <w:bookmarkEnd w:id="78"/>
+    <w:bookmarkStart w:id="79" w:name="sec-discussao-cap3"/>
     <w:p>
       <w:pPr>
         <w:pStyle w:val="Ttulo2"/>
@@ -6718,9 +6695,9 @@
         <w:t xml:space="preserve">Estas são evidências de que o partido prioriza candidaturas eleitoralmente relevantes com seus recursos e o aspecto mais importante a ser destacado é que isso pode ser observado mesmo antes da votação ocorrer. Este capítulo focou justamente na observação desta priorização, mas não revela mais do que isso. Para verificar estritamente a intencionalidade dos partidos, seria necessário um desenho quase experimental. Com os dados observacionais, entretanto, pode-se chegar ainda mais próximo da verificação desta intenção, ainda que não a identificando causalmente. Este será o foco do próximo capítulo, que verifica a construção deste núcleo de candidaturas priorizadas financeiramente ao longo do período da campanha pela análise dos registros datados de transferências entre partidos e candidatos.</w:t>
       </w:r>
     </w:p>
-    <w:bookmarkEnd w:id="78"/>
     <w:bookmarkEnd w:id="79"/>
-    <w:bookmarkStart w:id="100" w:name="Xb0ff3cdef3827d07830d1160b4986a9a425691a"/>
+    <w:bookmarkEnd w:id="80"/>
+    <w:bookmarkStart w:id="101" w:name="Xb0ff3cdef3827d07830d1160b4986a9a425691a"/>
     <w:p>
       <w:pPr>
         <w:pStyle w:val="Ttulo1"/>
@@ -6873,7 +6850,7 @@
       <w:tr>
         <w:tc>
           <w:tcPr/>
-          <w:bookmarkStart w:id="83" w:name="fig-semana-campanha"/>
+          <w:bookmarkStart w:id="84" w:name="fig-semana-campanha"/>
           <w:p>
             <w:pPr>
               <w:jc w:val="center"/>
@@ -6897,18 +6874,18 @@
                 <wp:inline>
                   <wp:extent cx="5600700" cy="3030967"/>
                   <wp:effectExtent b="0" l="0" r="0" t="0"/>
-                  <wp:docPr descr="" title="" id="81" name="Picture"/>
+                  <wp:docPr descr="" title="" id="82" name="Picture"/>
                   <a:graphic>
                     <a:graphicData uri="http://schemas.openxmlformats.org/drawingml/2006/picture">
                       <pic:pic>
                         <pic:nvPicPr>
-                          <pic:cNvPr descr="../figs/cap4_fluxo_cumulativo_prop.png" id="82" name="Picture"/>
+                          <pic:cNvPr descr="../figs/cap4_fluxo_cumulativo_prop.png" id="83" name="Picture"/>
                           <pic:cNvPicPr>
                             <a:picLocks noChangeArrowheads="1" noChangeAspect="1"/>
                           </pic:cNvPicPr>
                         </pic:nvPicPr>
                         <pic:blipFill>
-                          <a:blip r:embed="rId80"/>
+                          <a:blip r:embed="rId81"/>
                           <a:stretch>
                             <a:fillRect/>
                           </a:stretch>
@@ -6935,7 +6912,7 @@
               </w:drawing>
             </w:r>
           </w:p>
-          <w:bookmarkEnd w:id="83"/>
+          <w:bookmarkEnd w:id="84"/>
         </w:tc>
       </w:tr>
     </w:tbl>
@@ -6985,7 +6962,7 @@
       <w:tr>
         <w:tc>
           <w:tcPr/>
-          <w:bookmarkStart w:id="87" w:name="fig-semana-abs"/>
+          <w:bookmarkStart w:id="88" w:name="fig-semana-abs"/>
           <w:p>
             <w:pPr>
               <w:jc w:val="center"/>
@@ -7009,18 +6986,18 @@
                 <wp:inline>
                   <wp:extent cx="5600700" cy="3030967"/>
                   <wp:effectExtent b="0" l="0" r="0" t="0"/>
-                  <wp:docPr descr="" title="" id="85" name="Picture"/>
+                  <wp:docPr descr="" title="" id="86" name="Picture"/>
                   <a:graphic>
                     <a:graphicData uri="http://schemas.openxmlformats.org/drawingml/2006/picture">
                       <pic:pic>
                         <pic:nvPicPr>
-                          <pic:cNvPr descr="../figs/cap4_fluxo_cumulativo_abs.png" id="86" name="Picture"/>
+                          <pic:cNvPr descr="../figs/cap4_fluxo_cumulativo_abs.png" id="87" name="Picture"/>
                           <pic:cNvPicPr>
                             <a:picLocks noChangeArrowheads="1" noChangeAspect="1"/>
                           </pic:cNvPicPr>
                         </pic:nvPicPr>
                         <pic:blipFill>
-                          <a:blip r:embed="rId84"/>
+                          <a:blip r:embed="rId85"/>
                           <a:stretch>
                             <a:fillRect/>
                           </a:stretch>
@@ -7047,7 +7024,7 @@
               </w:drawing>
             </w:r>
           </w:p>
-          <w:bookmarkEnd w:id="87"/>
+          <w:bookmarkEnd w:id="88"/>
         </w:tc>
       </w:tr>
     </w:tbl>
@@ -7132,13 +7109,13 @@
         <w:t xml:space="preserve">também maior, nas duas eleições analisadas.</w:t>
       </w:r>
     </w:p>
-    <w:bookmarkStart w:id="96" w:name="Xcd3a4c171c1b3f7854da6821424a17ad2ae7cce"/>
+    <w:bookmarkStart w:id="97" w:name="X48c2094f377c8cdea7f95faeb29bacab7de370d"/>
     <w:p>
       <w:pPr>
         <w:pStyle w:val="Ttulo2"/>
       </w:pPr>
       <w:r>
-        <w:t xml:space="preserve">4.1 O timing do evento do repasses: Kaplan-Meier</w:t>
+        <w:t xml:space="preserve">4.1 O timing do evento do repasse: Kaplan-Meier</w:t>
       </w:r>
     </w:p>
     <w:p>
@@ -7224,7 +7201,7 @@
       <w:tr>
         <w:tc>
           <w:tcPr/>
-          <w:bookmarkStart w:id="91" w:name="fig-km-cs"/>
+          <w:bookmarkStart w:id="92" w:name="fig-km-cs"/>
           <w:p>
             <w:pPr>
               <w:jc w:val="center"/>
@@ -7248,18 +7225,18 @@
                 <wp:inline>
                   <wp:extent cx="5600700" cy="2899185"/>
                   <wp:effectExtent b="0" l="0" r="0" t="0"/>
-                  <wp:docPr descr="" title="" id="89" name="Picture"/>
+                  <wp:docPr descr="" title="" id="90" name="Picture"/>
                   <a:graphic>
                     <a:graphicData uri="http://schemas.openxmlformats.org/drawingml/2006/picture">
                       <pic:pic>
                         <pic:nvPicPr>
-                          <pic:cNvPr descr="../figs/cap4_survival_km_primeiro.png" id="90" name="Picture"/>
+                          <pic:cNvPr descr="../figs/cap4_survival_km_primeiro.png" id="91" name="Picture"/>
                           <pic:cNvPicPr>
                             <a:picLocks noChangeArrowheads="1" noChangeAspect="1"/>
                           </pic:cNvPicPr>
                         </pic:nvPicPr>
                         <pic:blipFill>
-                          <a:blip r:embed="rId88"/>
+                          <a:blip r:embed="rId89"/>
                           <a:stretch>
                             <a:fillRect/>
                           </a:stretch>
@@ -7286,7 +7263,7 @@
               </w:drawing>
             </w:r>
           </w:p>
-          <w:bookmarkEnd w:id="91"/>
+          <w:bookmarkEnd w:id="92"/>
         </w:tc>
       </w:tr>
     </w:tbl>
@@ -7311,7 +7288,7 @@
       <w:tr>
         <w:tc>
           <w:tcPr/>
-          <w:bookmarkStart w:id="95" w:name="fig-km-maior-cs"/>
+          <w:bookmarkStart w:id="96" w:name="fig-km-maior-cs"/>
           <w:p>
             <w:pPr>
               <w:jc w:val="center"/>
@@ -7335,18 +7312,18 @@
                 <wp:inline>
                   <wp:extent cx="5600700" cy="2899185"/>
                   <wp:effectExtent b="0" l="0" r="0" t="0"/>
-                  <wp:docPr descr="" title="" id="93" name="Picture"/>
+                  <wp:docPr descr="" title="" id="94" name="Picture"/>
                   <a:graphic>
                     <a:graphicData uri="http://schemas.openxmlformats.org/drawingml/2006/picture">
                       <pic:pic>
                         <pic:nvPicPr>
-                          <pic:cNvPr descr="../figs/cap4_survival_km_maior.png" id="94" name="Picture"/>
+                          <pic:cNvPr descr="../figs/cap4_survival_km_maior.png" id="95" name="Picture"/>
                           <pic:cNvPicPr>
                             <a:picLocks noChangeArrowheads="1" noChangeAspect="1"/>
                           </pic:cNvPicPr>
                         </pic:nvPicPr>
                         <pic:blipFill>
-                          <a:blip r:embed="rId92"/>
+                          <a:blip r:embed="rId93"/>
                           <a:stretch>
                             <a:fillRect/>
                           </a:stretch>
@@ -7373,12 +7350,12 @@
               </w:drawing>
             </w:r>
           </w:p>
-          <w:bookmarkEnd w:id="95"/>
+          <w:bookmarkEnd w:id="96"/>
         </w:tc>
       </w:tr>
     </w:tbl>
-    <w:bookmarkEnd w:id="96"/>
-    <w:bookmarkStart w:id="98" w:name="X1bf88997fe28a27ec1f2d34d5218a77fef3b7eb"/>
+    <w:bookmarkEnd w:id="97"/>
+    <w:bookmarkStart w:id="99" w:name="X1bf88997fe28a27ec1f2d34d5218a77fef3b7eb"/>
     <w:p>
       <w:pPr>
         <w:pStyle w:val="Ttulo2"/>
@@ -7480,7 +7457,7 @@
       <w:tr>
         <w:tc>
           <w:tcPr/>
-          <w:bookmarkStart w:id="97" w:name="tbl-cox"/>
+          <w:bookmarkStart w:id="98" w:name="tbl-cox"/>
           <w:p>
             <w:pPr>
               <w:jc w:val="center"/>
@@ -8316,13 +8293,13 @@
               </w:tc>
             </w:tr>
           </w:tbl>
-          <w:bookmarkEnd w:id="97"/>
+          <w:bookmarkEnd w:id="98"/>
           <w:p/>
         </w:tc>
       </w:tr>
     </w:tbl>
-    <w:bookmarkEnd w:id="98"/>
-    <w:bookmarkStart w:id="99" w:name="discussão-dos-resultados"/>
+    <w:bookmarkEnd w:id="99"/>
+    <w:bookmarkStart w:id="100" w:name="discussão-dos-resultados"/>
     <w:p>
       <w:pPr>
         <w:pStyle w:val="Ttulo2"/>
@@ -8331,9 +8308,9 @@
         <w:t xml:space="preserve">4.3 Discussão dos resultados</w:t>
       </w:r>
     </w:p>
-    <w:bookmarkEnd w:id="99"/>
     <w:bookmarkEnd w:id="100"/>
-    <w:bookmarkStart w:id="183" w:name="bibliography"/>
+    <w:bookmarkEnd w:id="101"/>
+    <w:bookmarkStart w:id="184" w:name="bibliography"/>
     <w:p>
       <w:pPr>
         <w:pStyle w:val="Ttulo1"/>
@@ -8342,8 +8319,8 @@
         <w:t xml:space="preserve">Referências</w:t>
       </w:r>
     </w:p>
-    <w:bookmarkStart w:id="182" w:name="refs"/>
-    <w:bookmarkStart w:id="101" w:name="ref-aldrich2011"/>
+    <w:bookmarkStart w:id="183" w:name="refs"/>
+    <w:bookmarkStart w:id="102" w:name="ref-aldrich2011"/>
     <w:p>
       <w:pPr>
         <w:pStyle w:val="Bibliografia"/>
@@ -8365,8 +8342,8 @@
         <w:t xml:space="preserve">. Chicago: University of Chicago Press, 2011.</w:t>
       </w:r>
     </w:p>
-    <w:bookmarkEnd w:id="101"/>
-    <w:bookmarkStart w:id="103" w:name="ref-ames1995"/>
+    <w:bookmarkEnd w:id="102"/>
+    <w:bookmarkStart w:id="104" w:name="ref-ames1995"/>
     <w:p>
       <w:pPr>
         <w:pStyle w:val="Bibliografia"/>
@@ -8377,7 +8354,7 @@
       <w:r>
         <w:t xml:space="preserve"> </w:t>
       </w:r>
-      <w:hyperlink r:id="rId102">
+      <w:hyperlink r:id="rId103">
         <w:r>
           <w:rPr>
             <w:rStyle w:val="Hyperlink"/>
@@ -8402,8 +8379,8 @@
         <w:t xml:space="preserve">, v. 39, n. 2, p. 406–433, 1995.</w:t>
       </w:r>
     </w:p>
-    <w:bookmarkEnd w:id="103"/>
-    <w:bookmarkStart w:id="104" w:name="ref-ames2001"/>
+    <w:bookmarkEnd w:id="104"/>
+    <w:bookmarkStart w:id="105" w:name="ref-ames2001"/>
     <w:p>
       <w:pPr>
         <w:pStyle w:val="Bibliografia"/>
@@ -8438,8 +8415,8 @@
         <w:t xml:space="preserve">: University of Michigan Press, 2001.</w:t>
       </w:r>
     </w:p>
-    <w:bookmarkEnd w:id="104"/>
-    <w:bookmarkStart w:id="106" w:name="ref-andreetal2015"/>
+    <w:bookmarkEnd w:id="105"/>
+    <w:bookmarkStart w:id="107" w:name="ref-andreetal2015"/>
     <w:p>
       <w:pPr>
         <w:pStyle w:val="Bibliografia"/>
@@ -8460,7 +8437,7 @@
       <w:r>
         <w:t xml:space="preserve"> </w:t>
       </w:r>
-      <w:hyperlink r:id="rId105">
+      <w:hyperlink r:id="rId106">
         <w:r>
           <w:rPr>
             <w:rStyle w:val="Hyperlink"/>
@@ -8482,8 +8459,8 @@
         <w:t xml:space="preserve">, v. 23, n. 5, p. 589–600, 2017.</w:t>
       </w:r>
     </w:p>
-    <w:bookmarkEnd w:id="106"/>
-    <w:bookmarkStart w:id="107" w:name="ref-avelino_barone2012"/>
+    <w:bookmarkEnd w:id="107"/>
+    <w:bookmarkStart w:id="108" w:name="ref-avelino_barone2012"/>
     <w:p>
       <w:pPr>
         <w:pStyle w:val="Bibliografia"/>
@@ -8520,8 +8497,8 @@
         <w:t xml:space="preserve">, v. 55, n. 4, p. 987–1013, 2012.</w:t>
       </w:r>
     </w:p>
-    <w:bookmarkEnd w:id="107"/>
-    <w:bookmarkStart w:id="109" w:name="ref-avelinobidermansilva2011"/>
+    <w:bookmarkEnd w:id="108"/>
+    <w:bookmarkStart w:id="110" w:name="ref-avelinobidermansilva2011"/>
     <w:p>
       <w:pPr>
         <w:pStyle w:val="Bibliografia"/>
@@ -8532,7 +8509,7 @@
       <w:r>
         <w:t xml:space="preserve"> </w:t>
       </w:r>
-      <w:hyperlink r:id="rId108">
+      <w:hyperlink r:id="rId109">
         <w:r>
           <w:rPr>
             <w:rStyle w:val="Hyperlink"/>
@@ -8557,8 +8534,8 @@
         <w:t xml:space="preserve">, v. 54, n. 2, 2011.</w:t>
       </w:r>
     </w:p>
-    <w:bookmarkEnd w:id="109"/>
-    <w:bookmarkStart w:id="111" w:name="ref-braga_amaral_2013_implicacoes"/>
+    <w:bookmarkEnd w:id="110"/>
+    <w:bookmarkStart w:id="112" w:name="ref-braga_amaral_2013_implicacoes"/>
     <w:p>
       <w:pPr>
         <w:pStyle w:val="Bibliografia"/>
@@ -8569,7 +8546,7 @@
       <w:r>
         <w:t xml:space="preserve"> </w:t>
       </w:r>
-      <w:hyperlink r:id="rId110">
+      <w:hyperlink r:id="rId111">
         <w:r>
           <w:rPr>
             <w:rStyle w:val="Hyperlink"/>
@@ -8594,8 +8571,8 @@
         <w:t xml:space="preserve">, v. 21, n. 46, p. 33–43, 2013.</w:t>
       </w:r>
     </w:p>
-    <w:bookmarkEnd w:id="111"/>
-    <w:bookmarkStart w:id="113" w:name="ref-careyshugart1995"/>
+    <w:bookmarkEnd w:id="112"/>
+    <w:bookmarkStart w:id="114" w:name="ref-careyshugart1995"/>
     <w:p>
       <w:pPr>
         <w:pStyle w:val="Bibliografia"/>
@@ -8606,7 +8583,7 @@
       <w:r>
         <w:t xml:space="preserve"> </w:t>
       </w:r>
-      <w:hyperlink r:id="rId112">
+      <w:hyperlink r:id="rId113">
         <w:r>
           <w:rPr>
             <w:rStyle w:val="Hyperlink"/>
@@ -8631,8 +8608,8 @@
         <w:t xml:space="preserve">, v. 14, n. 4, p. 417–439, 1995.</w:t>
       </w:r>
     </w:p>
-    <w:bookmarkEnd w:id="113"/>
-    <w:bookmarkStart w:id="115" w:name="ref-chang2005"/>
+    <w:bookmarkEnd w:id="114"/>
+    <w:bookmarkStart w:id="116" w:name="ref-chang2005"/>
     <w:p>
       <w:pPr>
         <w:pStyle w:val="Bibliografia"/>
@@ -8643,7 +8620,7 @@
       <w:r>
         <w:t xml:space="preserve"> </w:t>
       </w:r>
-      <w:hyperlink r:id="rId114">
+      <w:hyperlink r:id="rId115">
         <w:r>
           <w:rPr>
             <w:rStyle w:val="Hyperlink"/>
@@ -8668,8 +8645,8 @@
         <w:t xml:space="preserve">, v. 67, n. 3, p. 716–730, 2005.</w:t>
       </w:r>
     </w:p>
-    <w:bookmarkEnd w:id="115"/>
-    <w:bookmarkStart w:id="116" w:name="ref-cheibub_junqueira_moreira_2024"/>
+    <w:bookmarkEnd w:id="116"/>
+    <w:bookmarkStart w:id="117" w:name="ref-cheibub_junqueira_moreira_2024"/>
     <w:p>
       <w:pPr>
         <w:pStyle w:val="Bibliografia"/>
@@ -8719,8 +8696,8 @@
         <w:t xml:space="preserve">. 2024.</w:t>
       </w:r>
     </w:p>
-    <w:bookmarkEnd w:id="116"/>
-    <w:bookmarkStart w:id="118" w:name="ref-cheibubsin2020"/>
+    <w:bookmarkEnd w:id="117"/>
+    <w:bookmarkStart w:id="119" w:name="ref-cheibubsin2020"/>
     <w:p>
       <w:pPr>
         <w:pStyle w:val="Bibliografia"/>
@@ -8731,7 +8708,7 @@
       <w:r>
         <w:t xml:space="preserve"> </w:t>
       </w:r>
-      <w:hyperlink r:id="rId117">
+      <w:hyperlink r:id="rId118">
         <w:r>
           <w:rPr>
             <w:rStyle w:val="Hyperlink"/>
@@ -8780,8 +8757,8 @@
         <w:t xml:space="preserve">, v. 32, n. 1, p. 70–95, 2020.</w:t>
       </w:r>
     </w:p>
-    <w:bookmarkEnd w:id="118"/>
-    <w:bookmarkStart w:id="119" w:name="ref-cox1972"/>
+    <w:bookmarkEnd w:id="119"/>
+    <w:bookmarkStart w:id="120" w:name="ref-cox1972"/>
     <w:p>
       <w:pPr>
         <w:pStyle w:val="Bibliografia"/>
@@ -8803,8 +8780,8 @@
         <w:t xml:space="preserve">, v. 34, n. 2, p. 187–220, 1972.</w:t>
       </w:r>
     </w:p>
-    <w:bookmarkEnd w:id="119"/>
-    <w:bookmarkStart w:id="120" w:name="ref-cox1997"/>
+    <w:bookmarkEnd w:id="120"/>
+    <w:bookmarkStart w:id="121" w:name="ref-cox1997"/>
     <w:p>
       <w:pPr>
         <w:pStyle w:val="Bibliografia"/>
@@ -8826,8 +8803,8 @@
         <w:t xml:space="preserve">. Cambridge: Cambridge University Press, 1997.</w:t>
       </w:r>
     </w:p>
-    <w:bookmarkEnd w:id="120"/>
-    <w:bookmarkStart w:id="122" w:name="ref-cox_mccubbins_2005_setting"/>
+    <w:bookmarkEnd w:id="121"/>
+    <w:bookmarkStart w:id="123" w:name="ref-cox_mccubbins_2005_setting"/>
     <w:p>
       <w:pPr>
         <w:pStyle w:val="Bibliografia"/>
@@ -8838,7 +8815,7 @@
       <w:r>
         <w:t xml:space="preserve"> </w:t>
       </w:r>
-      <w:hyperlink r:id="rId121">
+      <w:hyperlink r:id="rId122">
         <w:r>
           <w:rPr>
             <w:rStyle w:val="Hyperlink"/>
@@ -8852,8 +8829,8 @@
         <w:t xml:space="preserve">. Cambridge: Cambridge University Press, 2005. p. 352</w:t>
       </w:r>
     </w:p>
-    <w:bookmarkEnd w:id="122"/>
-    <w:bookmarkStart w:id="124" w:name="ref-cox_thies_1998_cost"/>
+    <w:bookmarkEnd w:id="123"/>
+    <w:bookmarkStart w:id="125" w:name="ref-cox_thies_1998_cost"/>
     <w:p>
       <w:pPr>
         <w:pStyle w:val="Bibliografia"/>
@@ -8864,7 +8841,7 @@
       <w:r>
         <w:t xml:space="preserve"> </w:t>
       </w:r>
-      <w:hyperlink r:id="rId123">
+      <w:hyperlink r:id="rId124">
         <w:r>
           <w:rPr>
             <w:rStyle w:val="Hyperlink"/>
@@ -8889,8 +8866,8 @@
         <w:t xml:space="preserve">, v. 31, n. 3, p. 267–291, 1998.</w:t>
       </w:r>
     </w:p>
-    <w:bookmarkEnd w:id="124"/>
-    <w:bookmarkStart w:id="126" w:name="ref-crispetal2013"/>
+    <w:bookmarkEnd w:id="125"/>
+    <w:bookmarkStart w:id="127" w:name="ref-crispetal2013"/>
     <w:p>
       <w:pPr>
         <w:pStyle w:val="Bibliografia"/>
@@ -8911,7 +8888,7 @@
       <w:r>
         <w:t xml:space="preserve"> </w:t>
       </w:r>
-      <w:hyperlink r:id="rId125">
+      <w:hyperlink r:id="rId126">
         <w:r>
           <w:rPr>
             <w:rStyle w:val="Hyperlink"/>
@@ -8936,8 +8913,8 @@
         <w:t xml:space="preserve">, v. 32, n. 4, p. 658–669, 2013.</w:t>
       </w:r>
     </w:p>
-    <w:bookmarkEnd w:id="126"/>
-    <w:bookmarkStart w:id="128" w:name="ref-desposato_2006_impact"/>
+    <w:bookmarkEnd w:id="127"/>
+    <w:bookmarkStart w:id="129" w:name="ref-desposato_2006_impact"/>
     <w:p>
       <w:pPr>
         <w:pStyle w:val="Bibliografia"/>
@@ -8948,7 +8925,7 @@
       <w:r>
         <w:t xml:space="preserve"> </w:t>
       </w:r>
-      <w:hyperlink r:id="rId127">
+      <w:hyperlink r:id="rId128">
         <w:r>
           <w:rPr>
             <w:rStyle w:val="Hyperlink"/>
@@ -8973,8 +8950,8 @@
         <w:t xml:space="preserve">, v. 68, n. 4, p. 1018–1030, 2006.</w:t>
       </w:r>
     </w:p>
-    <w:bookmarkEnd w:id="128"/>
-    <w:bookmarkStart w:id="130" w:name="ref-ferree2014"/>
+    <w:bookmarkEnd w:id="129"/>
+    <w:bookmarkStart w:id="131" w:name="ref-ferree2014"/>
     <w:p>
       <w:pPr>
         <w:pStyle w:val="Bibliografia"/>
@@ -8985,7 +8962,7 @@
       <w:r>
         <w:t xml:space="preserve"> </w:t>
       </w:r>
-      <w:hyperlink r:id="rId129">
+      <w:hyperlink r:id="rId130">
         <w:r>
           <w:rPr>
             <w:rStyle w:val="Hyperlink"/>
@@ -9010,8 +8987,8 @@
         <w:t xml:space="preserve">, v. 17, p. 421–439, 2014.</w:t>
       </w:r>
     </w:p>
-    <w:bookmarkEnd w:id="130"/>
-    <w:bookmarkStart w:id="132" w:name="ref-figueiredo_limongi_2002_incentivos"/>
+    <w:bookmarkEnd w:id="131"/>
+    <w:bookmarkStart w:id="133" w:name="ref-figueiredo_limongi_2002_incentivos"/>
     <w:p>
       <w:pPr>
         <w:pStyle w:val="Bibliografia"/>
@@ -9022,7 +8999,7 @@
       <w:r>
         <w:t xml:space="preserve"> </w:t>
       </w:r>
-      <w:hyperlink r:id="rId131">
+      <w:hyperlink r:id="rId132">
         <w:r>
           <w:rPr>
             <w:rStyle w:val="Hyperlink"/>
@@ -9047,8 +9024,8 @@
         <w:t xml:space="preserve">, v. 45, n. 2, p. 303–344, 2002.</w:t>
       </w:r>
     </w:p>
-    <w:bookmarkEnd w:id="132"/>
-    <w:bookmarkStart w:id="133" w:name="ref-figueiredolimongi1999"/>
+    <w:bookmarkEnd w:id="133"/>
+    <w:bookmarkStart w:id="134" w:name="ref-figueiredolimongi1999"/>
     <w:p>
       <w:pPr>
         <w:pStyle w:val="Bibliografia"/>
@@ -9083,8 +9060,8 @@
         <w:t xml:space="preserve">: Editora FGV, 1999.</w:t>
       </w:r>
     </w:p>
-    <w:bookmarkEnd w:id="133"/>
-    <w:bookmarkStart w:id="135" w:name="ref-fivaetal2024"/>
+    <w:bookmarkEnd w:id="134"/>
+    <w:bookmarkStart w:id="136" w:name="ref-fivaetal2024"/>
     <w:p>
       <w:pPr>
         <w:pStyle w:val="Bibliografia"/>
@@ -9095,7 +9072,7 @@
       <w:r>
         <w:t xml:space="preserve"> </w:t>
       </w:r>
-      <w:hyperlink r:id="rId134">
+      <w:hyperlink r:id="rId135">
         <w:r>
           <w:rPr>
             <w:rStyle w:val="Hyperlink"/>
@@ -9120,8 +9097,8 @@
         <w:t xml:space="preserve">, v. 234, p. 105133, 2024.</w:t>
       </w:r>
     </w:p>
-    <w:bookmarkEnd w:id="135"/>
-    <w:bookmarkStart w:id="136" w:name="ref-guarnieri2011"/>
+    <w:bookmarkEnd w:id="136"/>
+    <w:bookmarkStart w:id="137" w:name="ref-guarnieri2011"/>
     <w:p>
       <w:pPr>
         <w:pStyle w:val="Bibliografia"/>
@@ -9143,8 +9120,8 @@
         <w:t xml:space="preserve">. Tese de Doutorado em Ciência Política—São Paulo: Universidade de São Paulo, 2011.</w:t>
       </w:r>
     </w:p>
-    <w:bookmarkEnd w:id="136"/>
-    <w:bookmarkStart w:id="138" w:name="Xcccddcf4a05ee10039b153d7c2eb1c7db0de70e"/>
+    <w:bookmarkEnd w:id="137"/>
+    <w:bookmarkStart w:id="139" w:name="Xcccddcf4a05ee10039b153d7c2eb1c7db0de70e"/>
     <w:p>
       <w:pPr>
         <w:pStyle w:val="Bibliografia"/>
@@ -9155,7 +9132,7 @@
       <w:r>
         <w:t xml:space="preserve"> </w:t>
       </w:r>
-      <w:hyperlink r:id="rId137">
+      <w:hyperlink r:id="rId138">
         <w:r>
           <w:rPr>
             <w:rStyle w:val="Hyperlink"/>
@@ -9180,8 +9157,8 @@
         <w:t xml:space="preserve">, v. 42, n. 3, p. 360–391, 2009.</w:t>
       </w:r>
     </w:p>
-    <w:bookmarkEnd w:id="138"/>
-    <w:bookmarkStart w:id="139" w:name="ref-hazan_rahat_2010"/>
+    <w:bookmarkEnd w:id="139"/>
+    <w:bookmarkStart w:id="140" w:name="ref-hazan_rahat_2010"/>
     <w:p>
       <w:pPr>
         <w:pStyle w:val="Bibliografia"/>
@@ -9203,8 +9180,8 @@
         <w:t xml:space="preserve">. Oxford: Oxford University Press, 2010.</w:t>
       </w:r>
     </w:p>
-    <w:bookmarkEnd w:id="139"/>
-    <w:bookmarkStart w:id="141" w:name="ref-hottmenezes2023"/>
+    <w:bookmarkEnd w:id="140"/>
+    <w:bookmarkStart w:id="142" w:name="ref-hottmenezes2023"/>
     <w:p>
       <w:pPr>
         <w:pStyle w:val="Bibliografia"/>
@@ -9215,7 +9192,7 @@
       <w:r>
         <w:t xml:space="preserve"> </w:t>
       </w:r>
-      <w:hyperlink r:id="rId140">
+      <w:hyperlink r:id="rId141">
         <w:r>
           <w:rPr>
             <w:rStyle w:val="Hyperlink"/>
@@ -9240,8 +9217,8 @@
         <w:t xml:space="preserve">, 2023.</w:t>
       </w:r>
     </w:p>
-    <w:bookmarkEnd w:id="141"/>
-    <w:bookmarkStart w:id="143" w:name="ref-janusz_barreiro_cintron_2021"/>
+    <w:bookmarkEnd w:id="142"/>
+    <w:bookmarkStart w:id="144" w:name="ref-janusz_barreiro_cintron_2021"/>
     <w:p>
       <w:pPr>
         <w:pStyle w:val="Bibliografia"/>
@@ -9252,7 +9229,7 @@
       <w:r>
         <w:t xml:space="preserve"> </w:t>
       </w:r>
-      <w:hyperlink r:id="rId142">
+      <w:hyperlink r:id="rId143">
         <w:r>
           <w:rPr>
             <w:rStyle w:val="Hyperlink"/>
@@ -9277,8 +9254,8 @@
         <w:t xml:space="preserve">, 2021.</w:t>
       </w:r>
     </w:p>
-    <w:bookmarkEnd w:id="143"/>
-    <w:bookmarkStart w:id="144" w:name="ref-katz1986"/>
+    <w:bookmarkEnd w:id="144"/>
+    <w:bookmarkStart w:id="145" w:name="ref-katz1986"/>
     <w:p>
       <w:pPr>
         <w:pStyle w:val="Bibliografia"/>
@@ -9313,8 +9290,8 @@
         <w:t xml:space="preserve">. New York: Agathon Press, 1986. p. 85–103.</w:t>
       </w:r>
     </w:p>
-    <w:bookmarkEnd w:id="144"/>
-    <w:bookmarkStart w:id="145" w:name="ref-kselman2011"/>
+    <w:bookmarkEnd w:id="145"/>
+    <w:bookmarkStart w:id="146" w:name="ref-kselman2011"/>
     <w:p>
       <w:pPr>
         <w:pStyle w:val="Bibliografia"/>
@@ -9349,8 +9326,8 @@
         <w:t xml:space="preserve">. Berlin: Springer Science &amp; Business Media, 2011. p. 327–371.</w:t>
       </w:r>
     </w:p>
-    <w:bookmarkEnd w:id="145"/>
-    <w:bookmarkStart w:id="146" w:name="ref-laaksotaagepera1979"/>
+    <w:bookmarkEnd w:id="146"/>
+    <w:bookmarkStart w:id="147" w:name="ref-laaksotaagepera1979"/>
     <w:p>
       <w:pPr>
         <w:pStyle w:val="Bibliografia"/>
@@ -9384,8 +9361,8 @@
         <w:t xml:space="preserve">, v. 12, 1979.</w:t>
       </w:r>
     </w:p>
-    <w:bookmarkEnd w:id="146"/>
-    <w:bookmarkStart w:id="147" w:name="ref-lemosmarcelinopederiva2010"/>
+    <w:bookmarkEnd w:id="147"/>
+    <w:bookmarkStart w:id="148" w:name="ref-lemosmarcelinopederiva2010"/>
     <w:p>
       <w:pPr>
         <w:pStyle w:val="Bibliografia"/>
@@ -9407,8 +9384,8 @@
         <w:t xml:space="preserve">, v. 16, n. 2, p. 366–393, 2010.</w:t>
       </w:r>
     </w:p>
-    <w:bookmarkEnd w:id="147"/>
-    <w:bookmarkStart w:id="148" w:name="ref-mainwaring1999"/>
+    <w:bookmarkEnd w:id="148"/>
+    <w:bookmarkStart w:id="149" w:name="ref-mainwaring1999"/>
     <w:p>
       <w:pPr>
         <w:pStyle w:val="Bibliografia"/>
@@ -9443,8 +9420,8 @@
         <w:t xml:space="preserve">: Stanford University Press, 1999.</w:t>
       </w:r>
     </w:p>
-    <w:bookmarkEnd w:id="148"/>
-    <w:bookmarkStart w:id="149" w:name="ref-mancuso2012"/>
+    <w:bookmarkEnd w:id="149"/>
+    <w:bookmarkStart w:id="150" w:name="ref-mancuso2012"/>
     <w:p>
       <w:pPr>
         <w:pStyle w:val="Bibliografia"/>
@@ -9495,8 +9472,8 @@
         <w:t xml:space="preserve">. Curitiba: CRV, 2012.</w:t>
       </w:r>
     </w:p>
-    <w:bookmarkEnd w:id="149"/>
-    <w:bookmarkStart w:id="151" w:name="ref-mancuso_2015_investimento"/>
+    <w:bookmarkEnd w:id="150"/>
+    <w:bookmarkStart w:id="152" w:name="ref-mancuso_2015_investimento"/>
     <w:p>
       <w:pPr>
         <w:pStyle w:val="Bibliografia"/>
@@ -9507,7 +9484,7 @@
       <w:r>
         <w:t xml:space="preserve"> </w:t>
       </w:r>
-      <w:hyperlink r:id="rId150">
+      <w:hyperlink r:id="rId151">
         <w:r>
           <w:rPr>
             <w:rStyle w:val="Hyperlink"/>
@@ -9532,8 +9509,8 @@
         <w:t xml:space="preserve">, v. 23, n. 54, p. 155–183, 2015.</w:t>
       </w:r>
     </w:p>
-    <w:bookmarkEnd w:id="151"/>
-    <w:bookmarkStart w:id="152" w:name="ref-marcelino2010"/>
+    <w:bookmarkEnd w:id="152"/>
+    <w:bookmarkStart w:id="153" w:name="ref-marcelino2010"/>
     <w:p>
       <w:pPr>
         <w:pStyle w:val="Bibliografia"/>
@@ -9555,8 +9532,8 @@
         <w:t xml:space="preserve">. mathesis—Brasília: Universidade de Brasília, 2010.</w:t>
       </w:r>
     </w:p>
-    <w:bookmarkEnd w:id="152"/>
-    <w:bookmarkStart w:id="153" w:name="ref-marsh1985"/>
+    <w:bookmarkEnd w:id="153"/>
+    <w:bookmarkStart w:id="154" w:name="ref-marsh1985"/>
     <w:p>
       <w:pPr>
         <w:pStyle w:val="Bibliografia"/>
@@ -9578,8 +9555,8 @@
         <w:t xml:space="preserve">, v. 13, n. 4, p. 365–378, 1985.</w:t>
       </w:r>
     </w:p>
-    <w:bookmarkEnd w:id="153"/>
-    <w:bookmarkStart w:id="155" w:name="ref-mershon2020"/>
+    <w:bookmarkEnd w:id="154"/>
+    <w:bookmarkStart w:id="156" w:name="ref-mershon2020"/>
     <w:p>
       <w:pPr>
         <w:pStyle w:val="Bibliografia"/>
@@ -9590,7 +9567,7 @@
       <w:r>
         <w:t xml:space="preserve"> </w:t>
       </w:r>
-      <w:hyperlink r:id="rId154">
+      <w:hyperlink r:id="rId155">
         <w:r>
           <w:rPr>
             <w:rStyle w:val="Hyperlink"/>
@@ -9615,8 +9592,8 @@
         <w:t xml:space="preserve">, v. 32, n. 1, p. 168–182, 2020.</w:t>
       </w:r>
     </w:p>
-    <w:bookmarkEnd w:id="155"/>
-    <w:bookmarkStart w:id="156" w:name="ref-papke1996"/>
+    <w:bookmarkEnd w:id="156"/>
+    <w:bookmarkStart w:id="157" w:name="ref-papke1996"/>
     <w:p>
       <w:pPr>
         <w:pStyle w:val="Bibliografia"/>
@@ -9638,8 +9615,8 @@
         <w:t xml:space="preserve">, v. 11, n. 6, p. 619–632, 1996.</w:t>
       </w:r>
     </w:p>
-    <w:bookmarkEnd w:id="156"/>
-    <w:bookmarkStart w:id="157" w:name="ref-rae1971"/>
+    <w:bookmarkEnd w:id="157"/>
+    <w:bookmarkStart w:id="158" w:name="ref-rae1971"/>
     <w:p>
       <w:pPr>
         <w:pStyle w:val="Bibliografia"/>
@@ -9661,8 +9638,8 @@
         <w:t xml:space="preserve">. Rev. ed. New Haven, CT: Yale University Press, 1971.</w:t>
       </w:r>
     </w:p>
-    <w:bookmarkEnd w:id="157"/>
-    <w:bookmarkStart w:id="159" w:name="ref-ribeiro2013_organizacao"/>
+    <w:bookmarkEnd w:id="158"/>
+    <w:bookmarkStart w:id="160" w:name="ref-ribeiro2013_organizacao"/>
     <w:p>
       <w:pPr>
         <w:pStyle w:val="Bibliografia"/>
@@ -9673,7 +9650,7 @@
       <w:r>
         <w:t xml:space="preserve"> </w:t>
       </w:r>
-      <w:hyperlink r:id="rId158">
+      <w:hyperlink r:id="rId159">
         <w:r>
           <w:rPr>
             <w:rStyle w:val="Hyperlink"/>
@@ -9756,8 +9733,8 @@
         <w:t xml:space="preserve">, n. 10, p. 225–265, 2013.</w:t>
       </w:r>
     </w:p>
-    <w:bookmarkEnd w:id="159"/>
-    <w:bookmarkStart w:id="161" w:name="ref-ribeiroetal2022"/>
+    <w:bookmarkEnd w:id="160"/>
+    <w:bookmarkStart w:id="162" w:name="ref-ribeiroetal2022"/>
     <w:p>
       <w:pPr>
         <w:pStyle w:val="Bibliografia"/>
@@ -9768,7 +9745,7 @@
       <w:r>
         <w:t xml:space="preserve"> </w:t>
       </w:r>
-      <w:hyperlink r:id="rId160">
+      <w:hyperlink r:id="rId161">
         <w:r>
           <w:rPr>
             <w:rStyle w:val="Hyperlink"/>
@@ -9823,8 +9800,8 @@
         <w:t xml:space="preserve">, v. 65, n. 4, 2022.</w:t>
       </w:r>
     </w:p>
-    <w:bookmarkEnd w:id="161"/>
-    <w:bookmarkStart w:id="162" w:name="ref-sacchetspeck2011"/>
+    <w:bookmarkEnd w:id="162"/>
+    <w:bookmarkStart w:id="163" w:name="ref-sacchetspeck2011"/>
     <w:p>
       <w:pPr>
         <w:pStyle w:val="Bibliografia"/>
@@ -9872,8 +9849,8 @@
         <w:t xml:space="preserve">.</w:t>
       </w:r>
     </w:p>
-    <w:bookmarkEnd w:id="162"/>
-    <w:bookmarkStart w:id="164" w:name="ref-samuels_2001_every_penny"/>
+    <w:bookmarkEnd w:id="163"/>
+    <w:bookmarkStart w:id="165" w:name="ref-samuels_2001_every_penny"/>
     <w:p>
       <w:pPr>
         <w:pStyle w:val="Bibliografia"/>
@@ -9884,7 +9861,7 @@
       <w:r>
         <w:t xml:space="preserve"> </w:t>
       </w:r>
-      <w:hyperlink r:id="rId163">
+      <w:hyperlink r:id="rId164">
         <w:r>
           <w:rPr>
             <w:rStyle w:val="Hyperlink"/>
@@ -9909,8 +9886,8 @@
         <w:t xml:space="preserve">, v. 7, n. 1, p. 89–102, a2001.</w:t>
       </w:r>
     </w:p>
-    <w:bookmarkEnd w:id="164"/>
-    <w:bookmarkStart w:id="165" w:name="ref-samuels2001a"/>
+    <w:bookmarkEnd w:id="165"/>
+    <w:bookmarkStart w:id="166" w:name="ref-samuels2001a"/>
     <w:p>
       <w:pPr>
         <w:pStyle w:val="Bibliografia"/>
@@ -9932,8 +9909,8 @@
         <w:t xml:space="preserve">, v. 43, n. 2, p. 27–48, b2001.</w:t>
       </w:r>
     </w:p>
-    <w:bookmarkEnd w:id="165"/>
-    <w:bookmarkStart w:id="167" w:name="ref-samuels1999"/>
+    <w:bookmarkEnd w:id="166"/>
+    <w:bookmarkStart w:id="168" w:name="ref-samuels1999"/>
     <w:p>
       <w:pPr>
         <w:pStyle w:val="Bibliografia"/>
@@ -9944,7 +9921,7 @@
       <w:r>
         <w:t xml:space="preserve"> </w:t>
       </w:r>
-      <w:hyperlink r:id="rId166">
+      <w:hyperlink r:id="rId167">
         <w:r>
           <w:rPr>
             <w:rStyle w:val="Hyperlink"/>
@@ -9969,8 +9946,8 @@
         <w:t xml:space="preserve">, v. 32, n. 4, p. 487–518, 1999.</w:t>
       </w:r>
     </w:p>
-    <w:bookmarkEnd w:id="167"/>
-    <w:bookmarkStart w:id="169" w:name="ref-scarrowwebb2017"/>
+    <w:bookmarkEnd w:id="168"/>
+    <w:bookmarkStart w:id="170" w:name="ref-scarrowwebb2017"/>
     <w:p>
       <w:pPr>
         <w:pStyle w:val="Bibliografia"/>
@@ -9981,7 +9958,7 @@
       <w:r>
         <w:t xml:space="preserve"> </w:t>
       </w:r>
-      <w:hyperlink r:id="rId168">
+      <w:hyperlink r:id="rId169">
         <w:r>
           <w:rPr>
             <w:rStyle w:val="Hyperlink"/>
@@ -10019,8 +9996,8 @@
         <w:t xml:space="preserve">. Oxford: Oxford University Press, 2017. p. 1–28.</w:t>
       </w:r>
     </w:p>
-    <w:bookmarkEnd w:id="169"/>
-    <w:bookmarkStart w:id="171" w:name="X2e2e025430be4033cf536ec71d2c1da710b73ab"/>
+    <w:bookmarkEnd w:id="170"/>
+    <w:bookmarkStart w:id="172" w:name="X2e2e025430be4033cf536ec71d2c1da710b73ab"/>
     <w:p>
       <w:pPr>
         <w:pStyle w:val="Bibliografia"/>
@@ -10031,7 +10008,7 @@
       <w:r>
         <w:t xml:space="preserve"> </w:t>
       </w:r>
-      <w:hyperlink r:id="rId170">
+      <w:hyperlink r:id="rId171">
         <w:r>
           <w:rPr>
             <w:rStyle w:val="Hyperlink"/>
@@ -10056,8 +10033,8 @@
         <w:t xml:space="preserve">, v. 42, n. 2, p. 277–301, 1999.</w:t>
       </w:r>
     </w:p>
-    <w:bookmarkEnd w:id="171"/>
-    <w:bookmarkStart w:id="173" w:name="ref-silotto2019"/>
+    <w:bookmarkEnd w:id="172"/>
+    <w:bookmarkStart w:id="174" w:name="ref-silotto2019"/>
     <w:p>
       <w:pPr>
         <w:pStyle w:val="Bibliografia"/>
@@ -10068,7 +10045,7 @@
       <w:r>
         <w:t xml:space="preserve"> </w:t>
       </w:r>
-      <w:hyperlink r:id="rId172">
+      <w:hyperlink r:id="rId173">
         <w:r>
           <w:rPr>
             <w:rStyle w:val="Hyperlink"/>
@@ -10105,8 +10082,8 @@
         <w:t xml:space="preserve">, v. 27, n. 69, p. e003, 2019.</w:t>
       </w:r>
     </w:p>
-    <w:bookmarkEnd w:id="173"/>
-    <w:bookmarkStart w:id="174" w:name="ref-silvacodato2024"/>
+    <w:bookmarkEnd w:id="174"/>
+    <w:bookmarkStart w:id="175" w:name="ref-silvacodato2024"/>
     <w:p>
       <w:pPr>
         <w:pStyle w:val="Bibliografia"/>
@@ -10128,8 +10105,8 @@
         <w:t xml:space="preserve">, v. 39, 2024.</w:t>
       </w:r>
     </w:p>
-    <w:bookmarkEnd w:id="174"/>
-    <w:bookmarkStart w:id="175" w:name="ref-speck2011"/>
+    <w:bookmarkEnd w:id="175"/>
+    <w:bookmarkStart w:id="176" w:name="ref-speck2011"/>
     <w:p>
       <w:pPr>
         <w:pStyle w:val="Bibliografia"/>
@@ -10177,8 +10154,8 @@
         <w:t xml:space="preserve">.</w:t>
       </w:r>
     </w:p>
-    <w:bookmarkEnd w:id="175"/>
-    <w:bookmarkStart w:id="177" w:name="ref-tavits2012"/>
+    <w:bookmarkEnd w:id="176"/>
+    <w:bookmarkStart w:id="178" w:name="ref-tavits2012"/>
     <w:p>
       <w:pPr>
         <w:pStyle w:val="Bibliografia"/>
@@ -10189,7 +10166,7 @@
       <w:r>
         <w:t xml:space="preserve"> </w:t>
       </w:r>
-      <w:hyperlink r:id="rId176">
+      <w:hyperlink r:id="rId177">
         <w:r>
           <w:rPr>
             <w:rStyle w:val="Hyperlink"/>
@@ -10203,8 +10180,8 @@
         <w:t xml:space="preserve">. Cambridge: Cambridge University Press, 2013.</w:t>
       </w:r>
     </w:p>
-    <w:bookmarkEnd w:id="177"/>
-    <w:bookmarkStart w:id="179" w:name="ref-thomsen2023"/>
+    <w:bookmarkEnd w:id="178"/>
+    <w:bookmarkStart w:id="180" w:name="ref-thomsen2023"/>
     <w:p>
       <w:pPr>
         <w:pStyle w:val="Bibliografia"/>
@@ -10215,7 +10192,7 @@
       <w:r>
         <w:t xml:space="preserve"> </w:t>
       </w:r>
-      <w:hyperlink r:id="rId178">
+      <w:hyperlink r:id="rId179">
         <w:r>
           <w:rPr>
             <w:rStyle w:val="Hyperlink"/>
@@ -10240,8 +10217,8 @@
         <w:t xml:space="preserve">, v. 117, n. 2, p. 675–691, 2023.</w:t>
       </w:r>
     </w:p>
-    <w:bookmarkEnd w:id="179"/>
-    <w:bookmarkStart w:id="181" w:name="ref-webbkeith2017"/>
+    <w:bookmarkEnd w:id="180"/>
+    <w:bookmarkStart w:id="182" w:name="ref-webbkeith2017"/>
     <w:p>
       <w:pPr>
         <w:pStyle w:val="Bibliografia"/>
@@ -10252,7 +10229,7 @@
       <w:r>
         <w:t xml:space="preserve"> </w:t>
       </w:r>
-      <w:hyperlink r:id="rId180">
+      <w:hyperlink r:id="rId181">
         <w:r>
           <w:rPr>
             <w:rStyle w:val="Hyperlink"/>
@@ -10290,9 +10267,9 @@
         <w:t xml:space="preserve">. Oxford: Oxford University Press, 2017. p. 29–62.</w:t>
       </w:r>
     </w:p>
-    <w:bookmarkEnd w:id="181"/>
     <w:bookmarkEnd w:id="182"/>
     <w:bookmarkEnd w:id="183"/>
+    <w:bookmarkEnd w:id="184"/>
     <w:sectPr>
       <w:pgSz w:h="15840" w:w="12240"/>
       <w:pgMar w:bottom="1417" w:footer="720" w:gutter="0" w:header="720" w:left="1701" w:right="1701" w:top="1417"/>
@@ -10319,6 +10296,49 @@
     <w:p>
       <w:r>
         <w:separator/>
+      </w:r>
+    </w:p>
+  </w:footnote>
+  <w:footnote w:id="33">
+    <w:p>
+      <w:pPr>
+        <w:pStyle w:val="Textodenotaderodap"/>
+      </w:pPr>
+      <w:r>
+        <w:rPr>
+          <w:rStyle w:val="Refdenotaderodap"/>
+        </w:rPr>
+        <w:footnoteRef/>
+      </w:r>
+      <w:r>
+        <w:t xml:space="preserve"> </w:t>
+      </w:r>
+      <w:r>
+        <w:t xml:space="preserve">Note-se que os termos</w:t>
+      </w:r>
+      <w:r>
+        <w:t xml:space="preserve"> </w:t>
+      </w:r>
+      <w:r>
+        <w:t xml:space="preserve">“candidaturas com credenciais eleitorais prévias”</w:t>
+      </w:r>
+      <w:r>
+        <w:t xml:space="preserve"> </w:t>
+      </w:r>
+      <w:r>
+        <w:t xml:space="preserve">e</w:t>
+      </w:r>
+      <w:r>
+        <w:t xml:space="preserve"> </w:t>
+      </w:r>
+      <w:r>
+        <w:t xml:space="preserve">“candidaturas competitivas”</w:t>
+      </w:r>
+      <w:r>
+        <w:t xml:space="preserve"> </w:t>
+      </w:r>
+      <w:r>
+        <w:t xml:space="preserve">se referem ao mesmo conjunto de concorrentes e são usados de maneira intercambiada.</w:t>
       </w:r>
     </w:p>
   </w:footnote>

</xml_diff>